<commit_message>
feat: implement report service to manage enterprise reporting cycles, creation, and submission workflows
</commit_message>
<xml_diff>
--- a/template_BC_TNLD.docx
+++ b/template_BC_TNLD.docx
@@ -540,10 +540,10 @@
       </w:tblPr>
       <w:tblGrid>
         <w:gridCol w:w="6948"/>
-        <w:gridCol w:w="477"/>
-        <w:gridCol w:w="477"/>
-        <w:gridCol w:w="477"/>
-        <w:gridCol w:w="477"/>
+        <w:gridCol w:w="1080"/>
+        <w:gridCol w:w="1080"/>
+        <w:gridCol w:w="1080"/>
+        <w:gridCol w:w="1140"/>
       </w:tblGrid>
       <w:tr>
         <w:trPr>
@@ -640,6 +640,7 @@
                 <w:color w:val="000000"/>
                 <w:sz w:val="24"/>
                 <w:szCs w:val="24"/>
+                <w:lang w:val="vi-VN"/>
               </w:rPr>
             </w:pPr>
             <w:r>
@@ -661,16 +662,6 @@
                 <w:lang w:val="vi-VN"/>
               </w:rPr>
               <w:t xml:space="preserve"> </w:t>
-            </w:r>
-            <w:r>
-              <w:rPr>
-                <w:rFonts w:eastAsia="Times New Roman" w:cs="Times New Roman"/>
-                <w:color w:val="000000"/>
-                <w:sz w:val="24"/>
-                <w:szCs w:val="24"/>
-                <w:lang w:val="vi-VN"/>
-              </w:rPr>
-              <w:t>{ma_loai_hinh}</w:t>
             </w:r>
           </w:p>
         </w:tc>
@@ -708,8 +699,9 @@
                 <w:color w:val="000000"/>
                 <w:sz w:val="24"/>
                 <w:szCs w:val="24"/>
-              </w:rPr>
-              <w:t> </w:t>
+                <w:lang w:val="vi-VN"/>
+              </w:rPr>
+              <w:t>{mlh_1}</w:t>
             </w:r>
           </w:p>
         </w:tc>
@@ -748,7 +740,7 @@
                 <w:sz w:val="24"/>
                 <w:szCs w:val="24"/>
               </w:rPr>
-              <w:t> </w:t>
+              <w:t>{mlh_2}</w:t>
             </w:r>
           </w:p>
         </w:tc>
@@ -787,7 +779,7 @@
                 <w:sz w:val="24"/>
                 <w:szCs w:val="24"/>
               </w:rPr>
-              <w:t> </w:t>
+              <w:t>{mlh_3}</w:t>
             </w:r>
           </w:p>
         </w:tc>
@@ -827,6 +819,15 @@
                 <w:szCs w:val="24"/>
               </w:rPr>
               <w:t> </w:t>
+            </w:r>
+            <w:r>
+              <w:rPr>
+                <w:rFonts w:eastAsia="Times New Roman" w:cs="Times New Roman"/>
+                <w:color w:val="000000"/>
+                <w:sz w:val="24"/>
+                <w:szCs w:val="24"/>
+              </w:rPr>
+              <w:t>{mlh_4}</w:t>
             </w:r>
           </w:p>
         </w:tc>
@@ -867,10 +868,10 @@
       </w:tblPr>
       <w:tblGrid>
         <w:gridCol w:w="6948"/>
-        <w:gridCol w:w="477"/>
-        <w:gridCol w:w="477"/>
-        <w:gridCol w:w="477"/>
-        <w:gridCol w:w="477"/>
+        <w:gridCol w:w="1080"/>
+        <w:gridCol w:w="1080"/>
+        <w:gridCol w:w="1080"/>
+        <w:gridCol w:w="1140"/>
       </w:tblGrid>
       <w:tr>
         <w:trPr>
@@ -976,16 +977,6 @@
               </w:rPr>
               <w:t xml:space="preserve"> </w:t>
             </w:r>
-            <w:r>
-              <w:rPr>
-                <w:rFonts w:eastAsia="Times New Roman" w:cs="Times New Roman"/>
-                <w:color w:val="000000"/>
-                <w:sz w:val="24"/>
-                <w:szCs w:val="24"/>
-                <w:lang w:val="vi-VN"/>
-              </w:rPr>
-              <w:t>{ma_linh_vuc}</w:t>
-            </w:r>
           </w:p>
         </w:tc>
         <w:tc>
@@ -1022,8 +1013,9 @@
                 <w:color w:val="000000"/>
                 <w:sz w:val="24"/>
                 <w:szCs w:val="24"/>
-              </w:rPr>
-              <w:t> </w:t>
+                <w:lang w:val="vi-VN"/>
+              </w:rPr>
+              <w:t>{mlv_1}</w:t>
             </w:r>
           </w:p>
         </w:tc>
@@ -1062,7 +1054,7 @@
                 <w:sz w:val="24"/>
                 <w:szCs w:val="24"/>
               </w:rPr>
-              <w:t> </w:t>
+              <w:t>{mlv_2}</w:t>
             </w:r>
           </w:p>
         </w:tc>
@@ -1101,7 +1093,7 @@
                 <w:sz w:val="24"/>
                 <w:szCs w:val="24"/>
               </w:rPr>
-              <w:t> </w:t>
+              <w:t>{mlv_3}</w:t>
             </w:r>
           </w:p>
         </w:tc>
@@ -1141,6 +1133,15 @@
                 <w:szCs w:val="24"/>
               </w:rPr>
               <w:t> </w:t>
+            </w:r>
+            <w:r>
+              <w:rPr>
+                <w:rFonts w:eastAsia="Times New Roman" w:cs="Times New Roman"/>
+                <w:color w:val="000000"/>
+                <w:sz w:val="24"/>
+                <w:szCs w:val="24"/>
+              </w:rPr>
+              <w:t>{mlv_4}</w:t>
             </w:r>
           </w:p>
         </w:tc>
@@ -2629,6 +2630,7 @@
                 <w:color w:val="000000"/>
                 <w:sz w:val="24"/>
                 <w:szCs w:val="24"/>
+                <w:lang w:val="nl-NL"/>
               </w:rPr>
             </w:pPr>
             <w:r>
@@ -2659,6 +2661,7 @@
                 <w:color w:val="000000"/>
                 <w:sz w:val="24"/>
                 <w:szCs w:val="24"/>
+                <w:lang w:val="nl-NL"/>
               </w:rPr>
             </w:pPr>
             <w:r>
@@ -2682,6 +2685,7 @@
                 <w:sz w:val="24"/>
                 <w:szCs w:val="24"/>
                 <w:vertAlign w:val="superscript"/>
+                <w:lang w:val="nl-NL"/>
               </w:rPr>
               <w:t>4</w:t>
             </w:r>
@@ -2703,6 +2707,7 @@
                 <w:color w:val="000000"/>
                 <w:sz w:val="24"/>
                 <w:szCs w:val="24"/>
+                <w:lang w:val="nl-NL"/>
               </w:rPr>
             </w:pPr>
             <w:r>
@@ -3051,6 +3056,7 @@
                 <w:color w:val="000000"/>
                 <w:sz w:val="24"/>
                 <w:szCs w:val="24"/>
+                <w:lang w:val="nl-NL"/>
               </w:rPr>
             </w:pPr>
             <w:r>
@@ -3091,6 +3097,7 @@
                 <w:color w:val="000000"/>
                 <w:sz w:val="24"/>
                 <w:szCs w:val="24"/>
+                <w:lang w:val="nl-NL"/>
               </w:rPr>
             </w:pPr>
             <w:r>
@@ -3113,6 +3120,7 @@
                 <w:color w:val="000000"/>
                 <w:sz w:val="24"/>
                 <w:szCs w:val="24"/>
+                <w:lang w:val="nl-NL"/>
               </w:rPr>
               <w:t>ố</w:t>
             </w:r>
@@ -3137,6 +3145,7 @@
                 <w:sz w:val="24"/>
                 <w:szCs w:val="24"/>
                 <w:vertAlign w:val="superscript"/>
+                <w:lang w:val="nl-NL"/>
               </w:rPr>
               <w:t>5</w:t>
             </w:r>
@@ -3611,6 +3620,7 @@
                 <w:color w:val="000000"/>
                 <w:sz w:val="24"/>
                 <w:szCs w:val="24"/>
+                <w:lang w:val="nl-NL"/>
               </w:rPr>
             </w:pPr>
             <w:r>
@@ -3959,6 +3969,7 @@
                 <w:color w:val="000000"/>
                 <w:sz w:val="24"/>
                 <w:szCs w:val="24"/>
+                <w:lang w:val="nl-NL"/>
               </w:rPr>
             </w:pPr>
             <w:r>
@@ -4671,6 +4682,7 @@
                 <w:color w:val="000000"/>
                 <w:sz w:val="24"/>
                 <w:szCs w:val="24"/>
+                <w:lang w:val="nl-NL"/>
               </w:rPr>
             </w:pPr>
             <w:r>
@@ -5070,6 +5082,7 @@
                 <w:color w:val="000000"/>
                 <w:sz w:val="24"/>
                 <w:szCs w:val="24"/>
+                <w:lang w:val="nl-NL"/>
               </w:rPr>
             </w:pPr>
             <w:r>
@@ -7112,6 +7125,7 @@
   <w:style w:type="character" w:default="1" w:styleId="DefaultParagraphFont">
     <w:name w:val="Default Paragraph Font"/>
     <w:uiPriority w:val="1"/>
+    <w:semiHidden/>
     <w:unhideWhenUsed/>
   </w:style>
   <w:style w:type="table" w:default="1" w:styleId="TableNormal">

</xml_diff>